<commit_message>
update response to reviewers, add ROC picture
</commit_message>
<xml_diff>
--- a/Paper/Medical_Physics/Response to reviews.docx
+++ b/Paper/Medical_Physics/Response to reviews.docx
@@ -1,6 +1,6 @@
 
 <file path=word/document.xml><?xml version="1.0" encoding="utf-8"?>
-<w:document xmlns:wpc="http://schemas.microsoft.com/office/word/2010/wordprocessingCanvas" xmlns:cx="http://schemas.microsoft.com/office/drawing/2014/chartex" xmlns:cx1="http://schemas.microsoft.com/office/drawing/2015/9/8/chartex" xmlns:mc="http://schemas.openxmlformats.org/markup-compatibility/2006" xmlns:o="urn:schemas-microsoft-com:office:office" xmlns:r="http://schemas.openxmlformats.org/officeDocument/2006/relationships" xmlns:m="http://schemas.openxmlformats.org/officeDocument/2006/math" xmlns:v="urn:schemas-microsoft-com:vml" xmlns:wp14="http://schemas.microsoft.com/office/word/2010/wordprocessingDrawing" xmlns:wp="http://schemas.openxmlformats.org/drawingml/2006/wordprocessingDrawing" xmlns:w10="urn:schemas-microsoft-com:office:word" xmlns:w="http://schemas.openxmlformats.org/wordprocessingml/2006/main" xmlns:w14="http://schemas.microsoft.com/office/word/2010/wordml" xmlns:w15="http://schemas.microsoft.com/office/word/2012/wordml" xmlns:w16se="http://schemas.microsoft.com/office/word/2015/wordml/symex" xmlns:wpg="http://schemas.microsoft.com/office/word/2010/wordprocessingGroup" xmlns:wpi="http://schemas.microsoft.com/office/word/2010/wordprocessingInk" xmlns:wne="http://schemas.microsoft.com/office/word/2006/wordml" xmlns:wps="http://schemas.microsoft.com/office/word/2010/wordprocessingShape" mc:Ignorable="w14 w15 w16se wp14">
+<w:document xmlns:wpc="http://schemas.microsoft.com/office/word/2010/wordprocessingCanvas" xmlns:cx="http://schemas.microsoft.com/office/drawing/2014/chartex" xmlns:cx1="http://schemas.microsoft.com/office/drawing/2015/9/8/chartex" xmlns:cx2="http://schemas.microsoft.com/office/drawing/2015/10/21/chartex" xmlns:cx3="http://schemas.microsoft.com/office/drawing/2016/5/9/chartex" xmlns:cx4="http://schemas.microsoft.com/office/drawing/2016/5/10/chartex" xmlns:cx5="http://schemas.microsoft.com/office/drawing/2016/5/11/chartex" xmlns:cx6="http://schemas.microsoft.com/office/drawing/2016/5/12/chartex" xmlns:cx7="http://schemas.microsoft.com/office/drawing/2016/5/13/chartex" xmlns:cx8="http://schemas.microsoft.com/office/drawing/2016/5/14/chartex" xmlns:mc="http://schemas.openxmlformats.org/markup-compatibility/2006" xmlns:aink="http://schemas.microsoft.com/office/drawing/2016/ink" xmlns:am3d="http://schemas.microsoft.com/office/drawing/2017/model3d" xmlns:o="urn:schemas-microsoft-com:office:office" xmlns:r="http://schemas.openxmlformats.org/officeDocument/2006/relationships" xmlns:m="http://schemas.openxmlformats.org/officeDocument/2006/math" xmlns:v="urn:schemas-microsoft-com:vml" xmlns:wp14="http://schemas.microsoft.com/office/word/2010/wordprocessingDrawing" xmlns:wp="http://schemas.openxmlformats.org/drawingml/2006/wordprocessingDrawing" xmlns:w10="urn:schemas-microsoft-com:office:word" xmlns:w="http://schemas.openxmlformats.org/wordprocessingml/2006/main" xmlns:w14="http://schemas.microsoft.com/office/word/2010/wordml" xmlns:w15="http://schemas.microsoft.com/office/word/2012/wordml" xmlns:w16cex="http://schemas.microsoft.com/office/word/2018/wordml/cex" xmlns:w16cid="http://schemas.microsoft.com/office/word/2016/wordml/cid" xmlns:w16="http://schemas.microsoft.com/office/word/2018/wordml" xmlns:w16sdtdh="http://schemas.microsoft.com/office/word/2020/wordml/sdtdatahash" xmlns:w16se="http://schemas.microsoft.com/office/word/2015/wordml/symex" xmlns:wpg="http://schemas.microsoft.com/office/word/2010/wordprocessingGroup" xmlns:wpi="http://schemas.microsoft.com/office/word/2010/wordprocessingInk" xmlns:wne="http://schemas.microsoft.com/office/word/2006/wordml" xmlns:wps="http://schemas.microsoft.com/office/word/2010/wordprocessingShape" mc:Ignorable="w14 w15 w16se w16cid w16 w16cex w16sdtdh wp14">
   <w:body>
     <w:p>
       <w:pPr>
@@ -28,8 +28,13 @@
     </w:p>
     <w:p>
       <w:r>
-        <w:t>Line 84: mean 660 days, is it correct ?</w:t>
-      </w:r>
+        <w:t xml:space="preserve">Line 84: mean 660 days, is it </w:t>
+      </w:r>
+      <w:proofErr w:type="gramStart"/>
+      <w:r>
+        <w:t>correct ?</w:t>
+      </w:r>
+      <w:proofErr w:type="gramEnd"/>
     </w:p>
     <w:p>
       <w:r>
@@ -39,7 +44,15 @@
     </w:p>
     <w:p>
       <w:r>
-        <w:t>Table 1 : Please add bit more description in caption</w:t>
+        <w:t xml:space="preserve">Table </w:t>
+      </w:r>
+      <w:proofErr w:type="gramStart"/>
+      <w:r>
+        <w:t>1 :</w:t>
+      </w:r>
+      <w:proofErr w:type="gramEnd"/>
+      <w:r>
+        <w:t xml:space="preserve"> Please add bit more description in caption</w:t>
       </w:r>
     </w:p>
     <w:p>
@@ -145,7 +158,15 @@
     </w:p>
     <w:p>
       <w:r>
-        <w:t>Yes. However, the DIR method used "novel"? It has been employed clinically as part of RayStation for some time.</w:t>
+        <w:t xml:space="preserve">Yes. However, the DIR method used "novel"? It has been employed clinically as part of </w:t>
+      </w:r>
+      <w:proofErr w:type="spellStart"/>
+      <w:r>
+        <w:t>RayStation</w:t>
+      </w:r>
+      <w:proofErr w:type="spellEnd"/>
+      <w:r>
+        <w:t xml:space="preserve"> for some time.</w:t>
       </w:r>
     </w:p>
     <w:p>
@@ -188,16 +209,32 @@
         <w:ind w:left="720"/>
       </w:pPr>
       <w:r>
-        <w:t>We have met with a research scientist from Raystation on identifying and implementing the optimal parameters and hope to create a technical note for the work soon.</w:t>
-      </w:r>
-    </w:p>
-    <w:p>
-      <w:pPr>
-        <w:keepNext/>
-        <w:keepLines/>
-      </w:pPr>
-      <w:r>
-        <w:t>The method employed for identifying insufficient ablation margins intersecting with recurrence isn't technically ray-tracing. It is more appropriately termed cone tracing or an overlap test (and is a method used for increased computational efficiency in ray tracing - i.e. essentially bundling rays).</w:t>
+        <w:t xml:space="preserve">We have met with a research scientist from </w:t>
+      </w:r>
+      <w:proofErr w:type="spellStart"/>
+      <w:r>
+        <w:t>Raystation</w:t>
+      </w:r>
+      <w:proofErr w:type="spellEnd"/>
+      <w:r>
+        <w:t xml:space="preserve"> on identifying and implementing the optimal parameters and hope to create a technical note for the work soon.</w:t>
+      </w:r>
+    </w:p>
+    <w:p>
+      <w:pPr>
+        <w:keepNext/>
+        <w:keepLines/>
+      </w:pPr>
+      <w:r>
+        <w:t xml:space="preserve">The method employed for identifying insufficient ablation margins intersecting with recurrence isn't technically ray-tracing. It is more appropriately termed cone tracing or an overlap test (and is a method used for increased computational efficiency in ray tracing - </w:t>
+      </w:r>
+      <w:proofErr w:type="gramStart"/>
+      <w:r>
+        <w:t>i.e.</w:t>
+      </w:r>
+      <w:proofErr w:type="gramEnd"/>
+      <w:r>
+        <w:t xml:space="preserve"> essentially bundling rays).</w:t>
       </w:r>
     </w:p>
     <w:p>
@@ -479,7 +516,15 @@
       </w:pPr>
       <w:r>
         <w:lastRenderedPageBreak/>
-        <w:t>3. This reviewer agrees the vessel-based rigid approach the authors take to assess recurrence while mitigating potential alignment issues associated with tissue remodeling and regeneration seems to be the most sensible and practical approach. However, thermal ablation is known to activate a complex variety of growth factors that encourage hepatocyte and vascular growth over time (e.g. see https://pubs.rsna.org/doi/full/10.1148/radiol.2016152241). While difficult to predict or yet measure, and I do not expect the authors to do so, even the locally rigid registration determined by vascular landmarks could be distorted by relative differences in tissue regrowth during recovery, which may in turn affect the alignment accuracy when assessing recurrence. Considering that the authors later state the overlap between recurrence and untreated margin to be less than 5 mL in the majority of cases, the possibility for the alignment of the recurrence image to be off should be recognized.</w:t>
+        <w:t>3. This reviewer agrees the vessel-based rigid approach the authors take to assess recurrence while mitigating potential alignment issues associated with tissue remodeling and regeneration seems to be the most sensible and practical approach. However, thermal ablation is known to activate a complex variety of growth factors that encourage hepatocyte and vascular growth over time (</w:t>
+      </w:r>
+      <w:proofErr w:type="gramStart"/>
+      <w:r>
+        <w:t>e.g.</w:t>
+      </w:r>
+      <w:proofErr w:type="gramEnd"/>
+      <w:r>
+        <w:t xml:space="preserve"> see https://pubs.rsna.org/doi/full/10.1148/radiol.2016152241). While difficult to predict or yet measure, and I do not expect the authors to do so, even the locally rigid registration determined by vascular landmarks could be distorted by relative differences in tissue regrowth during recovery, which may in turn affect the alignment accuracy when assessing recurrence. Considering that the authors later state the overlap between recurrence and untreated margin to be less than 5 mL in the majority of cases, the possibility for the alignment of the recurrence image to be off should be recognized.</w:t>
       </w:r>
     </w:p>
     <w:p>
@@ -554,6 +599,48 @@
         <w:rPr>
           <w:b/>
         </w:rPr>
+        <w:t>Title</w:t>
+      </w:r>
+    </w:p>
+    <w:p>
+      <w:pPr>
+        <w:keepNext/>
+        <w:keepLines/>
+        <w:rPr>
+          <w:bCs/>
+        </w:rPr>
+      </w:pPr>
+      <w:r>
+        <w:rPr>
+          <w:bCs/>
+        </w:rPr>
+        <w:t xml:space="preserve">The authors agree that this is more of a novel application of a biomechanical model, rather than a novel biomechanical model. </w:t>
+      </w:r>
+      <w:r>
+        <w:rPr>
+          <w:bCs/>
+        </w:rPr>
+        <w:t>The title has been changed to ‘’A novel use</w:t>
+      </w:r>
+      <w:r>
+        <w:rPr>
+          <w:bCs/>
+        </w:rPr>
+        <w:t xml:space="preserve"> of biomechanical…’</w:t>
+      </w:r>
+    </w:p>
+    <w:p>
+      <w:pPr>
+        <w:keepNext/>
+        <w:keepLines/>
+        <w:rPr>
+          <w:b/>
+        </w:rPr>
+      </w:pPr>
+      <w:r>
+        <w:rPr>
+          <w:b/>
+        </w:rPr>
         <w:t>Abstract</w:t>
       </w:r>
     </w:p>
@@ -570,6 +657,15 @@
       <w:pPr>
         <w:keepNext/>
         <w:keepLines/>
+      </w:pPr>
+      <w:r>
+        <w:t>We have reworded ‘correlation’ to ‘qualitative collocation’ in agreement with a lacking of statistical correlations in the paper.</w:t>
+      </w:r>
+    </w:p>
+    <w:p>
+      <w:pPr>
+        <w:keepNext/>
+        <w:keepLines/>
         <w:rPr>
           <w:b/>
         </w:rPr>
@@ -587,41 +683,62 @@
         <w:keepLines/>
       </w:pPr>
       <w:r>
-        <w:t>1. The measured minimum delivered margin is accurate only on the order of the registration error. No registration, even biomechanical, is perfectly accurate. How does registration error in these patients affect the clinical accuracy of the MDM measure? While the authors describe the fidelity of the deformable registration algorithm to be "accurate to the order of image voxel size", it seems that neither of the citations the authors provided to justify this statement actually evaluated registration accuracy on image pairs collected across a similar 45-day temporal window, or before and after thermal ablation treatment which may cause changes in material properties or produce materially inelastic effects due to inflammation or other compensatory physiological responses. Therefore to this reviewer, the actual registration accuracy of the method is uncharacterized for the present application, and the authors seem to be exaggerating the reliability of the registration method.</w:t>
-      </w:r>
-    </w:p>
-    <w:p>
-      <w:pPr>
-        <w:keepNext/>
-        <w:keepLines/>
-      </w:pPr>
-    </w:p>
-    <w:p>
-      <w:pPr>
-        <w:keepNext/>
-        <w:keepLines/>
-      </w:pPr>
-      <w:r>
-        <w:t>2. The description for biomechanical modeling seems off. They authors state Morfeus uses a finite element method, but only discuss parameters for the generation of triangular surface meshes as opposed to the grid of volumetric elements that are fundamentally necessary to solve the displacement field.</w:t>
-      </w:r>
-    </w:p>
-    <w:p>
-      <w:pPr>
-        <w:keepNext/>
-        <w:keepLines/>
-        <w:rPr>
-          <w:b/>
-        </w:rPr>
-      </w:pPr>
-      <w:r>
-        <w:rPr>
-          <w:b/>
-        </w:rPr>
-        <w:lastRenderedPageBreak/>
+        <w:t xml:space="preserve">1. The measured minimum delivered margin is accurate only on the order of the registration error. No registration, even biomechanical, is perfectly accurate. How does registration error in these patients affect the clinical accuracy of the MDM measure? While the authors describe the fidelity of the deformable registration algorithm to be "accurate to the order of image voxel size", it seems that neither of the citations the authors provided to justify this statement actually evaluated registration accuracy on image pairs collected across a similar 45-day temporal window, or before and after thermal ablation treatment which may cause changes in material properties or produce materially inelastic effects due to inflammation or other compensatory physiological responses. </w:t>
+      </w:r>
+      <w:proofErr w:type="gramStart"/>
+      <w:r>
+        <w:t>Therefore</w:t>
+      </w:r>
+      <w:proofErr w:type="gramEnd"/>
+      <w:r>
+        <w:t xml:space="preserve"> to this reviewer, the actual registration accuracy of the method is uncharacterized for the present application, and the authors seem to be exaggerating the reliability of the registration method.</w:t>
+      </w:r>
+    </w:p>
+    <w:p>
+      <w:pPr>
+        <w:keepNext/>
+        <w:keepLines/>
+      </w:pPr>
+    </w:p>
+    <w:p>
+      <w:pPr>
+        <w:keepNext/>
+        <w:keepLines/>
+      </w:pPr>
+      <w:r>
+        <w:t xml:space="preserve">2. The description for biomechanical modeling seems off. They </w:t>
+      </w:r>
+      <w:proofErr w:type="gramStart"/>
+      <w:r>
+        <w:t>authors</w:t>
+      </w:r>
+      <w:proofErr w:type="gramEnd"/>
+      <w:r>
+        <w:t xml:space="preserve"> state </w:t>
+      </w:r>
+      <w:proofErr w:type="spellStart"/>
+      <w:r>
+        <w:t>Morfeus</w:t>
+      </w:r>
+      <w:proofErr w:type="spellEnd"/>
+      <w:r>
+        <w:t xml:space="preserve"> uses a finite element method, but only discuss parameters for the generation of triangular surface meshes as opposed to the grid of volumetric elements that are fundamentally necessary to solve the displacement field.</w:t>
+      </w:r>
+    </w:p>
+    <w:p>
+      <w:pPr>
+        <w:keepNext/>
+        <w:keepLines/>
+        <w:rPr>
+          <w:b/>
+        </w:rPr>
+      </w:pPr>
+      <w:r>
+        <w:rPr>
+          <w:b/>
+        </w:rPr>
         <w:t>Results</w:t>
       </w:r>
-      <w:bookmarkStart w:id="0" w:name="_GoBack"/>
-      <w:bookmarkEnd w:id="0"/>
     </w:p>
     <w:p>
       <w:pPr>
@@ -630,6 +747,16 @@
       </w:pPr>
       <w:r>
         <w:t>Though the authors report significant difference between margins of recurrent and non-recurrent patients as their main result, a very weak effect can still be found to be statistically significant. This reviewer does not see the finding of significant difference to necessarily be evidence of clinical utility. An ROC curve or similar analysis on this dataset would greatly inform predictive capability of recurrence based on observed imaging margins. Extending the analysis this way would better serve the stated purpose of the paper, "[to] differentiate patients with local tumor progression and those receiving sufficient ablation delivery". As written, this reviewer does not find the endpoint of results reported in the paper to be particularly ambitious or exciting, although the importance of the overall direction set by this paper is recognized.</w:t>
+      </w:r>
+    </w:p>
+    <w:p>
+      <w:pPr>
+        <w:keepNext/>
+        <w:keepLines/>
+        <w:ind w:firstLine="720"/>
+      </w:pPr>
+      <w:r>
+        <w:t>We agree, the biomechanical liver model is described further in lines 132-138</w:t>
       </w:r>
     </w:p>
     <w:p>
@@ -692,15 +819,8 @@
 </w:document>
 </file>
 
-<file path=word/commentsIds.xml><?xml version="1.0" encoding="utf-8"?>
-<w16cid:commentsIds xmlns:wpc="http://schemas.microsoft.com/office/word/2010/wordprocessingCanvas" xmlns:cx="http://schemas.microsoft.com/office/drawing/2014/chartex" xmlns:cx1="http://schemas.microsoft.com/office/drawing/2015/9/8/chartex" xmlns:cx2="http://schemas.microsoft.com/office/drawing/2015/10/21/chartex" xmlns:cx3="http://schemas.microsoft.com/office/drawing/2016/5/9/chartex" xmlns:cx4="http://schemas.microsoft.com/office/drawing/2016/5/10/chartex" xmlns:cx5="http://schemas.microsoft.com/office/drawing/2016/5/11/chartex" xmlns:cx6="http://schemas.microsoft.com/office/drawing/2016/5/12/chartex" xmlns:cx7="http://schemas.microsoft.com/office/drawing/2016/5/13/chartex" xmlns:cx8="http://schemas.microsoft.com/office/drawing/2016/5/14/chartex" xmlns:mc="http://schemas.openxmlformats.org/markup-compatibility/2006" xmlns:aink="http://schemas.microsoft.com/office/drawing/2016/ink" xmlns:am3d="http://schemas.microsoft.com/office/drawing/2017/model3d" xmlns:o="urn:schemas-microsoft-com:office:office" xmlns:r="http://schemas.openxmlformats.org/officeDocument/2006/relationships" xmlns:m="http://schemas.openxmlformats.org/officeDocument/2006/math" xmlns:v="urn:schemas-microsoft-com:vml" xmlns:wp14="http://schemas.microsoft.com/office/word/2010/wordprocessingDrawing" xmlns:wp="http://schemas.openxmlformats.org/drawingml/2006/wordprocessingDrawing" xmlns:w10="urn:schemas-microsoft-com:office:word" xmlns:w="http://schemas.openxmlformats.org/wordprocessingml/2006/main" xmlns:w14="http://schemas.microsoft.com/office/word/2010/wordml" xmlns:w15="http://schemas.microsoft.com/office/word/2012/wordml" xmlns:w16cex="http://schemas.microsoft.com/office/word/2018/wordml/cex" xmlns:w16cid="http://schemas.microsoft.com/office/word/2016/wordml/cid" xmlns:w16="http://schemas.microsoft.com/office/word/2018/wordml" xmlns:w16se="http://schemas.microsoft.com/office/word/2015/wordml/symex" xmlns:wpg="http://schemas.microsoft.com/office/word/2010/wordprocessingGroup" xmlns:wpi="http://schemas.microsoft.com/office/word/2010/wordprocessingInk" xmlns:wne="http://schemas.microsoft.com/office/word/2006/wordml" xmlns:wps="http://schemas.microsoft.com/office/word/2010/wordprocessingShape" mc:Ignorable="w14 w15 w16se w16cid w16 w16cex wp14">
-  <w16cid:commentId w16cid:paraId="2318ABDC" w16cid:durableId="2458B1F4"/>
-  <w16cid:commentId w16cid:paraId="0485D2B8" w16cid:durableId="2458B1F5"/>
-</w16cid:commentsIds>
-</file>
-
 <file path=word/styles.xml><?xml version="1.0" encoding="utf-8"?>
-<w:styles xmlns:mc="http://schemas.openxmlformats.org/markup-compatibility/2006" xmlns:r="http://schemas.openxmlformats.org/officeDocument/2006/relationships" xmlns:w="http://schemas.openxmlformats.org/wordprocessingml/2006/main" xmlns:w14="http://schemas.microsoft.com/office/word/2010/wordml" xmlns:w15="http://schemas.microsoft.com/office/word/2012/wordml" xmlns:w16se="http://schemas.microsoft.com/office/word/2015/wordml/symex" mc:Ignorable="w14 w15 w16se">
+<w:styles xmlns:mc="http://schemas.openxmlformats.org/markup-compatibility/2006" xmlns:r="http://schemas.openxmlformats.org/officeDocument/2006/relationships" xmlns:w="http://schemas.openxmlformats.org/wordprocessingml/2006/main" xmlns:w14="http://schemas.microsoft.com/office/word/2010/wordml" xmlns:w15="http://schemas.microsoft.com/office/word/2012/wordml" xmlns:w16cex="http://schemas.microsoft.com/office/word/2018/wordml/cex" xmlns:w16cid="http://schemas.microsoft.com/office/word/2016/wordml/cid" xmlns:w16="http://schemas.microsoft.com/office/word/2018/wordml" xmlns:w16sdtdh="http://schemas.microsoft.com/office/word/2020/wordml/sdtdatahash" xmlns:w16se="http://schemas.microsoft.com/office/word/2015/wordml/symex" mc:Ignorable="w14 w15 w16se w16cid w16 w16cex w16sdtdh">
   <w:docDefaults>
     <w:rPrDefault>
       <w:rPr>
@@ -716,7 +836,7 @@
       </w:pPr>
     </w:pPrDefault>
   </w:docDefaults>
-  <w:latentStyles w:defLockedState="0" w:defUIPriority="99" w:defSemiHidden="0" w:defUnhideWhenUsed="0" w:defQFormat="0" w:count="371">
+  <w:latentStyles w:defLockedState="0" w:defUIPriority="99" w:defSemiHidden="0" w:defUnhideWhenUsed="0" w:defQFormat="0" w:count="376">
     <w:lsdException w:name="Normal" w:uiPriority="0" w:qFormat="1"/>
     <w:lsdException w:name="heading 1" w:uiPriority="9" w:qFormat="1"/>
     <w:lsdException w:name="heading 2" w:semiHidden="1" w:uiPriority="9" w:unhideWhenUsed="1" w:qFormat="1"/>
@@ -822,7 +942,6 @@
     <w:lsdException w:name="HTML Sample" w:semiHidden="1" w:unhideWhenUsed="1"/>
     <w:lsdException w:name="HTML Typewriter" w:semiHidden="1" w:unhideWhenUsed="1"/>
     <w:lsdException w:name="HTML Variable" w:semiHidden="1" w:unhideWhenUsed="1"/>
-    <w:lsdException w:name="Normal Table" w:semiHidden="1" w:unhideWhenUsed="1"/>
     <w:lsdException w:name="annotation subject" w:semiHidden="1" w:unhideWhenUsed="1"/>
     <w:lsdException w:name="No List" w:semiHidden="1" w:unhideWhenUsed="1"/>
     <w:lsdException w:name="Outline List 1" w:semiHidden="1" w:unhideWhenUsed="1"/>
@@ -865,11 +984,8 @@
     <w:lsdException w:name="Table Contemporary" w:semiHidden="1" w:unhideWhenUsed="1"/>
     <w:lsdException w:name="Table Elegant" w:semiHidden="1" w:unhideWhenUsed="1"/>
     <w:lsdException w:name="Table Professional" w:semiHidden="1" w:unhideWhenUsed="1"/>
-    <w:lsdException w:name="Table Subtle 1" w:semiHidden="1" w:unhideWhenUsed="1"/>
     <w:lsdException w:name="Table Subtle 2" w:semiHidden="1" w:unhideWhenUsed="1"/>
     <w:lsdException w:name="Table Web 1" w:semiHidden="1" w:unhideWhenUsed="1"/>
-    <w:lsdException w:name="Table Web 2" w:semiHidden="1" w:unhideWhenUsed="1"/>
-    <w:lsdException w:name="Table Web 3" w:semiHidden="1" w:unhideWhenUsed="1"/>
     <w:lsdException w:name="Balloon Text" w:semiHidden="1" w:unhideWhenUsed="1"/>
     <w:lsdException w:name="Table Grid" w:uiPriority="39"/>
     <w:lsdException w:name="Table Theme" w:semiHidden="1" w:unhideWhenUsed="1"/>
@@ -1088,6 +1204,11 @@
     <w:lsdException w:name="List Table 5 Dark Accent 6" w:uiPriority="50"/>
     <w:lsdException w:name="List Table 6 Colorful Accent 6" w:uiPriority="51"/>
     <w:lsdException w:name="List Table 7 Colorful Accent 6" w:uiPriority="52"/>
+    <w:lsdException w:name="Mention" w:semiHidden="1" w:unhideWhenUsed="1"/>
+    <w:lsdException w:name="Smart Hyperlink" w:semiHidden="1" w:unhideWhenUsed="1"/>
+    <w:lsdException w:name="Hashtag" w:semiHidden="1" w:unhideWhenUsed="1"/>
+    <w:lsdException w:name="Unresolved Mention" w:semiHidden="1" w:unhideWhenUsed="1"/>
+    <w:lsdException w:name="Smart Link" w:semiHidden="1" w:unhideWhenUsed="1"/>
   </w:latentStyles>
   <w:style w:type="paragraph" w:default="1" w:styleId="Normal">
     <w:name w:val="Normal"/>

</xml_diff>